<commit_message>
Improve resume layout with bullets and bold technical keywords
</commit_message>
<xml_diff>
--- a/resume/Sumit_Singh_Jadaun_Resume.docx
+++ b/resume/Sumit_Singh_Jadaun_Resume.docx
@@ -3,28 +3,59 @@
 <w:document xmlns:wpc="http://schemas.microsoft.com/office/word/2010/wordprocessingCanvas" xmlns:mo="http://schemas.microsoft.com/office/mac/office/2008/main" xmlns:mc="http://schemas.openxmlformats.org/markup-compatibility/2006" xmlns:mv="urn:schemas-microsoft-com:mac:vml" xmlns:o="urn:schemas-microsoft-com:office:office" xmlns:r="http://schemas.openxmlformats.org/officeDocument/2006/relationships" xmlns:m="http://schemas.openxmlformats.org/officeDocument/2006/math" xmlns:v="urn:schemas-microsoft-com:vml" xmlns:wp14="http://schemas.microsoft.com/office/word/2010/wordprocessingDrawing" xmlns:wp="http://schemas.openxmlformats.org/drawingml/2006/wordprocessingDrawing" xmlns:w10="urn:schemas-microsoft-com:office:word" xmlns:w="http://schemas.openxmlformats.org/wordprocessingml/2006/main" xmlns:w14="http://schemas.microsoft.com/office/word/2010/wordml" xmlns:wpg="http://schemas.microsoft.com/office/word/2010/wordprocessingGroup" xmlns:wpi="http://schemas.microsoft.com/office/word/2010/wordprocessingInk" xmlns:wne="http://schemas.microsoft.com/office/word/2006/wordml" xmlns:wps="http://schemas.microsoft.com/office/word/2010/wordprocessingShape" mc:Ignorable="w14 wp14">
   <w:body>
     <w:p>
+      <w:pPr>
+        <w:spacing w:before="0"/>
+      </w:pPr>
       <w:r>
         <w:rPr>
           <w:b/>
-          <w:sz w:val="30"/>
+          <w:color w:val="17354F"/>
+          <w:sz w:val="40"/>
         </w:rPr>
         <w:t>SUMIT SINGH JADAUN</w:t>
       </w:r>
     </w:p>
     <w:p>
+      <w:pPr>
+        <w:ind w:right="1584"/>
+      </w:pPr>
       <w:r>
-        <w:t>Go / Python Lead Engineer | Cloud-Native Services &amp; Infrastructure Automation</w:t>
+        <w:t xml:space="preserve">Go / </w:t>
+      </w:r>
+      <w:r>
+        <w:rPr>
+          <w:b/>
+        </w:rPr>
+        <w:t>Python</w:t>
+      </w:r>
+      <w:r>
+        <w:t xml:space="preserve"> Lead Engineer | Cloud-Native Services &amp; Infrastructure Automation</w:t>
       </w:r>
     </w:p>
     <w:p>
+      <w:pPr>
+        <w:ind w:right="1584"/>
+      </w:pPr>
       <w:r>
-        <w:t>+91 8073420319 | sumitsinghjadaun@gmail.com | Bangalore, India | Open to roles across India</w:t>
+        <w:t>+91 8073420319 | sumitsinghjadaun@gmail.com</w:t>
       </w:r>
     </w:p>
     <w:p>
+      <w:pPr>
+        <w:ind w:right="1584"/>
+      </w:pPr>
+      <w:r>
+        <w:t>Bangalore, India | Open to roles across India</w:t>
+      </w:r>
+    </w:p>
+    <w:p>
+      <w:pPr>
+        <w:spacing w:before="120"/>
+      </w:pPr>
       <w:r>
         <w:rPr>
           <w:b/>
+          <w:color w:val="17354F"/>
           <w:sz w:val="20"/>
         </w:rPr>
         <w:t>PROFESSIONAL SUMMARY</w:t>
@@ -32,13 +63,116 @@
     </w:p>
     <w:p>
       <w:r>
-        <w:t>Software engineering professional with 13+ years of experience spanning backend services, Python automation, and converged/hyperconverged infrastructure. Principal Software Engineer experience at Dell Technologies, with contributions to microservice design and leadership of a six-engineer Python development team. Hands-on work with Go microservices, Kubernetes, Temporal, Kafka, REST APIs, and gRPC.</w:t>
+        <w:t xml:space="preserve">Software engineering professional with </w:t>
+      </w:r>
+      <w:r>
+        <w:rPr>
+          <w:b/>
+        </w:rPr>
+        <w:t>13+ years</w:t>
+      </w:r>
+      <w:r>
+        <w:t xml:space="preserve"> of experience spanning backend services, </w:t>
+      </w:r>
+      <w:r>
+        <w:rPr>
+          <w:b/>
+        </w:rPr>
+        <w:t>Python</w:t>
+      </w:r>
+      <w:r>
+        <w:t xml:space="preserve"> automation, and converged/hyperconverged infrastructure. </w:t>
+      </w:r>
+      <w:r>
+        <w:rPr>
+          <w:b/>
+        </w:rPr>
+        <w:t>Principal Software Engineer</w:t>
+      </w:r>
+      <w:r>
+        <w:t xml:space="preserve"> experience at Dell Technologies, with contributions to </w:t>
+      </w:r>
+      <w:r>
+        <w:rPr>
+          <w:b/>
+        </w:rPr>
+        <w:t>microservice design</w:t>
+      </w:r>
+      <w:r>
+        <w:t xml:space="preserve"> and leadership of a </w:t>
+      </w:r>
+      <w:r>
+        <w:rPr>
+          <w:b/>
+        </w:rPr>
+        <w:t>six-engineer</w:t>
+      </w:r>
+      <w:r>
+        <w:t xml:space="preserve"> </w:t>
+      </w:r>
+      <w:r>
+        <w:rPr>
+          <w:b/>
+        </w:rPr>
+        <w:t>Python</w:t>
+      </w:r>
+      <w:r>
+        <w:t xml:space="preserve"> development team. Hands-on work with </w:t>
+      </w:r>
+      <w:r>
+        <w:rPr>
+          <w:b/>
+        </w:rPr>
+        <w:t>Go microservices</w:t>
+      </w:r>
+      <w:r>
+        <w:t xml:space="preserve">, </w:t>
+      </w:r>
+      <w:r>
+        <w:rPr>
+          <w:b/>
+        </w:rPr>
+        <w:t>Kubernetes</w:t>
+      </w:r>
+      <w:r>
+        <w:t xml:space="preserve">, Temporal, </w:t>
+      </w:r>
+      <w:r>
+        <w:rPr>
+          <w:b/>
+        </w:rPr>
+        <w:t>Kafka</w:t>
+      </w:r>
+      <w:r>
+        <w:t xml:space="preserve">, </w:t>
+      </w:r>
+      <w:r>
+        <w:rPr>
+          <w:b/>
+        </w:rPr>
+        <w:t>REST APIs</w:t>
+      </w:r>
+      <w:r>
+        <w:t xml:space="preserve">, and </w:t>
+      </w:r>
+      <w:r>
+        <w:rPr>
+          <w:b/>
+        </w:rPr>
+        <w:t>gRPC</w:t>
+      </w:r>
+      <w:r>
+        <w:t>.</w:t>
       </w:r>
     </w:p>
     <w:p>
+      <w:pPr>
+        <w:spacing w:before="120"/>
+      </w:pPr>
       <w:r>
         <w:rPr>
           <w:b/>
+          <w:color w:val="17354F"/>
           <w:sz w:val="20"/>
         </w:rPr>
         <w:t>TECHNICAL SKILLS</w:t>
@@ -46,13 +180,202 @@
     </w:p>
     <w:p>
       <w:r>
-        <w:t>Languages: Go (Golang), Python | Backend: Microservices, REST APIs, gRPC, Protocol Buffers, OpenAPI, Temporal | Platform: Kubernetes, Helm, Docker, Linux, Git | Messaging &amp; Security: Apache Kafka, SASL authentication, HashiCorp Vault, authorization, audit logging | Automation: Ansible, Python modules | Infrastructure: VMware ESXi, storage, SAN networking</w:t>
+        <w:t xml:space="preserve">Languages: </w:t>
+      </w:r>
+      <w:r>
+        <w:rPr>
+          <w:b/>
+        </w:rPr>
+        <w:t>Go (Golang)</w:t>
+      </w:r>
+      <w:r>
+        <w:t xml:space="preserve">, </w:t>
+      </w:r>
+      <w:r>
+        <w:rPr>
+          <w:b/>
+        </w:rPr>
+        <w:t>Python</w:t>
+      </w:r>
+      <w:r/>
+    </w:p>
+    <w:p>
+      <w:r>
+        <w:t xml:space="preserve">Backend: Microservices, </w:t>
+      </w:r>
+      <w:r>
+        <w:rPr>
+          <w:b/>
+        </w:rPr>
+        <w:t>REST APIs</w:t>
+      </w:r>
+      <w:r>
+        <w:t xml:space="preserve">, </w:t>
+      </w:r>
+      <w:r>
+        <w:rPr>
+          <w:b/>
+        </w:rPr>
+        <w:t>gRPC</w:t>
+      </w:r>
+      <w:r>
+        <w:t xml:space="preserve">, </w:t>
+      </w:r>
+      <w:r>
+        <w:rPr>
+          <w:b/>
+        </w:rPr>
+        <w:t>Protocol Buffers</w:t>
+      </w:r>
+      <w:r>
+        <w:t xml:space="preserve">, </w:t>
+      </w:r>
+      <w:r>
+        <w:rPr>
+          <w:b/>
+        </w:rPr>
+        <w:t>OpenAPI</w:t>
+      </w:r>
+      <w:r>
+        <w:t>, Temporal</w:t>
       </w:r>
     </w:p>
     <w:p>
       <w:r>
+        <w:t xml:space="preserve">Platform: </w:t>
+      </w:r>
+      <w:r>
         <w:rPr>
           <w:b/>
+        </w:rPr>
+        <w:t>Kubernetes</w:t>
+      </w:r>
+      <w:r>
+        <w:t xml:space="preserve">, </w:t>
+      </w:r>
+      <w:r>
+        <w:rPr>
+          <w:b/>
+        </w:rPr>
+        <w:t>Helm</w:t>
+      </w:r>
+      <w:r>
+        <w:t xml:space="preserve">, </w:t>
+      </w:r>
+      <w:r>
+        <w:rPr>
+          <w:b/>
+        </w:rPr>
+        <w:t>Docker</w:t>
+      </w:r>
+      <w:r>
+        <w:t xml:space="preserve">, </w:t>
+      </w:r>
+      <w:r>
+        <w:rPr>
+          <w:b/>
+        </w:rPr>
+        <w:t>Linux</w:t>
+      </w:r>
+      <w:r>
+        <w:t xml:space="preserve">, </w:t>
+      </w:r>
+      <w:r>
+        <w:rPr>
+          <w:b/>
+        </w:rPr>
+        <w:t>Git</w:t>
+      </w:r>
+      <w:r/>
+    </w:p>
+    <w:p>
+      <w:r>
+        <w:t xml:space="preserve">Messaging &amp; Security: </w:t>
+      </w:r>
+      <w:r>
+        <w:rPr>
+          <w:b/>
+        </w:rPr>
+        <w:t>Kafka</w:t>
+      </w:r>
+      <w:r>
+        <w:t xml:space="preserve">, </w:t>
+      </w:r>
+      <w:r>
+        <w:rPr>
+          <w:b/>
+        </w:rPr>
+        <w:t>SASL</w:t>
+      </w:r>
+      <w:r>
+        <w:t xml:space="preserve">, </w:t>
+      </w:r>
+      <w:r>
+        <w:rPr>
+          <w:b/>
+        </w:rPr>
+        <w:t>HashiCorp Vault</w:t>
+      </w:r>
+      <w:r>
+        <w:t xml:space="preserve">, </w:t>
+      </w:r>
+      <w:r>
+        <w:rPr>
+          <w:b/>
+        </w:rPr>
+        <w:t>authorization</w:t>
+      </w:r>
+      <w:r>
+        <w:t xml:space="preserve">, </w:t>
+      </w:r>
+      <w:r>
+        <w:rPr>
+          <w:b/>
+        </w:rPr>
+        <w:t>audit logging</w:t>
+      </w:r>
+      <w:r/>
+    </w:p>
+    <w:p>
+      <w:r>
+        <w:t xml:space="preserve">Automation &amp; Infrastructure: </w:t>
+      </w:r>
+      <w:r>
+        <w:rPr>
+          <w:b/>
+        </w:rPr>
+        <w:t>Ansible</w:t>
+      </w:r>
+      <w:r>
+        <w:t xml:space="preserve">, </w:t>
+      </w:r>
+      <w:r>
+        <w:rPr>
+          <w:b/>
+        </w:rPr>
+        <w:t>Python</w:t>
+      </w:r>
+      <w:r>
+        <w:t xml:space="preserve"> modules, </w:t>
+      </w:r>
+      <w:r>
+        <w:rPr>
+          <w:b/>
+        </w:rPr>
+        <w:t>VMware ESXi</w:t>
+      </w:r>
+      <w:r>
+        <w:t>, storage, SAN networking</w:t>
+      </w:r>
+    </w:p>
+    <w:p>
+      <w:pPr>
+        <w:spacing w:before="120"/>
+      </w:pPr>
+      <w:r>
+        <w:rPr>
+          <w:b/>
+          <w:color w:val="17354F"/>
           <w:sz w:val="20"/>
         </w:rPr>
         <w:t>PROFESSIONAL EXPERIENCE</w:t>
@@ -62,94 +385,335 @@
       <w:r>
         <w:rPr>
           <w:b/>
+          <w:color w:val="17354F"/>
         </w:rPr>
         <w:t>Dell Technologies | Principal / Senior Software Engineer | Oct 2019–May 2026</w:t>
       </w:r>
     </w:p>
     <w:p>
       <w:pPr>
-        <w:ind w:left="115"/>
+        <w:pStyle w:val="ListBullet"/>
       </w:pPr>
       <w:r>
-        <w:t>Led six engineers developing the Atlas Python automation framework; implemented logging and reporting enhancements and completed Python 3.6-to-3.10 and plugin migration.</w:t>
+        <w:t xml:space="preserve">Led </w:t>
+      </w:r>
+      <w:r>
+        <w:rPr>
+          <w:b/>
+        </w:rPr>
+        <w:t>six engineers</w:t>
+      </w:r>
+      <w:r>
+        <w:t xml:space="preserve"> developing the Atlas </w:t>
+      </w:r>
+      <w:r>
+        <w:rPr>
+          <w:b/>
+        </w:rPr>
+        <w:t>Python</w:t>
+      </w:r>
+      <w:r>
+        <w:t xml:space="preserve"> automation framework; implemented logging and reporting enhancements and completed </w:t>
+      </w:r>
+      <w:r>
+        <w:rPr>
+          <w:b/>
+        </w:rPr>
+        <w:t>Python</w:t>
+      </w:r>
+      <w:r>
+        <w:t xml:space="preserve"> 3.6-to-3.10 and plugin migration.</w:t>
       </w:r>
     </w:p>
     <w:p>
       <w:pPr>
-        <w:ind w:left="115"/>
+        <w:pStyle w:val="ListBullet"/>
       </w:pPr>
       <w:r>
-        <w:t>Built Go services using the Temporal Go SDK to start workflows and handle pause, resume, and cancellation signals; implemented REST interfaces, OpenAPI generation, and gRPC health checks.</w:t>
+        <w:t xml:space="preserve">Built </w:t>
+      </w:r>
+      <w:r>
+        <w:rPr>
+          <w:b/>
+        </w:rPr>
+        <w:t>Go services</w:t>
+      </w:r>
+      <w:r>
+        <w:t xml:space="preserve"> using the </w:t>
+      </w:r>
+      <w:r>
+        <w:rPr>
+          <w:b/>
+        </w:rPr>
+        <w:t>Temporal Go SDK</w:t>
+      </w:r>
+      <w:r>
+        <w:t xml:space="preserve"> to start workflows and handle pause, resume, and cancellation signals; implemented </w:t>
+      </w:r>
+      <w:r>
+        <w:rPr>
+          <w:b/>
+        </w:rPr>
+        <w:t>REST interfaces</w:t>
+      </w:r>
+      <w:r>
+        <w:t xml:space="preserve">, </w:t>
+      </w:r>
+      <w:r>
+        <w:rPr>
+          <w:b/>
+        </w:rPr>
+        <w:t>OpenAPI</w:t>
+      </w:r>
+      <w:r>
+        <w:t xml:space="preserve"> generation, and </w:t>
+      </w:r>
+      <w:r>
+        <w:rPr>
+          <w:b/>
+        </w:rPr>
+        <w:t>gRPC</w:t>
+      </w:r>
+      <w:r>
+        <w:t xml:space="preserve"> health checks.</w:t>
       </w:r>
     </w:p>
     <w:p>
       <w:pPr>
-        <w:ind w:left="115"/>
+        <w:pStyle w:val="ListBullet"/>
       </w:pPr>
       <w:r>
-        <w:t>Developed authorization APIs and audit-logging middleware with Protocol Buffers and Kafka producers using SASL authentication; implemented retry handling for Kafka and Vault connectivity.</w:t>
+        <w:t xml:space="preserve">Developed </w:t>
+      </w:r>
+      <w:r>
+        <w:rPr>
+          <w:b/>
+        </w:rPr>
+        <w:t>authorization</w:t>
+      </w:r>
+      <w:r>
+        <w:t xml:space="preserve"> APIs and audit-logging middleware with </w:t>
+      </w:r>
+      <w:r>
+        <w:rPr>
+          <w:b/>
+        </w:rPr>
+        <w:t>Protocol Buffers</w:t>
+      </w:r>
+      <w:r>
+        <w:t xml:space="preserve"> and </w:t>
+      </w:r>
+      <w:r>
+        <w:rPr>
+          <w:b/>
+        </w:rPr>
+        <w:t>Kafka</w:t>
+      </w:r>
+      <w:r>
+        <w:t xml:space="preserve"> producers using </w:t>
+      </w:r>
+      <w:r>
+        <w:rPr>
+          <w:b/>
+        </w:rPr>
+        <w:t>SASL</w:t>
+      </w:r>
+      <w:r>
+        <w:t xml:space="preserve"> authentication; implemented retry handling for </w:t>
+      </w:r>
+      <w:r>
+        <w:rPr>
+          <w:b/>
+        </w:rPr>
+        <w:t>Kafka</w:t>
+      </w:r>
+      <w:r>
+        <w:t xml:space="preserve"> and </w:t>
+      </w:r>
+      <w:r>
+        <w:rPr>
+          <w:b/>
+        </w:rPr>
+        <w:t>Vault</w:t>
+      </w:r>
+      <w:r>
+        <w:t xml:space="preserve"> connectivity.</w:t>
       </w:r>
     </w:p>
     <w:p>
       <w:pPr>
-        <w:ind w:left="115"/>
+        <w:pStyle w:val="ListBullet"/>
       </w:pPr>
       <w:r>
-        <w:t>Created Helm charts for Kubernetes deployments across development, staging, and production environments, including services, configuration, secrets, and service accounts.</w:t>
+        <w:t xml:space="preserve">Created </w:t>
+      </w:r>
+      <w:r>
+        <w:rPr>
+          <w:b/>
+        </w:rPr>
+        <w:t>Helm</w:t>
+      </w:r>
+      <w:r>
+        <w:t xml:space="preserve"> charts for </w:t>
+      </w:r>
+      <w:r>
+        <w:rPr>
+          <w:b/>
+        </w:rPr>
+        <w:t>Kubernetes</w:t>
+      </w:r>
+      <w:r>
+        <w:t xml:space="preserve"> deployments across development, staging, and production environments, including services, configuration, secrets, and service accounts.</w:t>
       </w:r>
     </w:p>
     <w:p>
       <w:pPr>
-        <w:ind w:left="115"/>
+        <w:pStyle w:val="ListBullet"/>
       </w:pPr>
       <w:r>
-        <w:t>Contributed more than 60% of the cloud-interface microservice code for the On-Prem Cloud Controller; implemented REST APIs and developed Ansible playbooks and Python modules for infrastructure automation.</w:t>
+        <w:t xml:space="preserve">Contributed </w:t>
+      </w:r>
+      <w:r>
+        <w:rPr>
+          <w:b/>
+        </w:rPr>
+        <w:t>more than 60%</w:t>
+      </w:r>
+      <w:r>
+        <w:t xml:space="preserve"> of the cloud-interface microservice code for the On-Prem Cloud Controller; implemented </w:t>
+      </w:r>
+      <w:r>
+        <w:rPr>
+          <w:b/>
+        </w:rPr>
+        <w:t>REST APIs</w:t>
+      </w:r>
+      <w:r>
+        <w:t xml:space="preserve"> and developed </w:t>
+      </w:r>
+      <w:r>
+        <w:rPr>
+          <w:b/>
+        </w:rPr>
+        <w:t>Ansible</w:t>
+      </w:r>
+      <w:r>
+        <w:t xml:space="preserve"> playbooks and </w:t>
+      </w:r>
+      <w:r>
+        <w:rPr>
+          <w:b/>
+        </w:rPr>
+        <w:t>Python</w:t>
+      </w:r>
+      <w:r>
+        <w:t xml:space="preserve"> modules for </w:t>
+      </w:r>
+      <w:r>
+        <w:rPr>
+          <w:b/>
+        </w:rPr>
+        <w:t>infrastructure automation</w:t>
+      </w:r>
+      <w:r>
+        <w:t>.</w:t>
       </w:r>
     </w:p>
     <w:p>
       <w:r>
         <w:rPr>
           <w:b/>
+          <w:color w:val="17354F"/>
         </w:rPr>
         <w:t>HCL Technologies | Technical Lead / Senior Software Engineer | May 2015–Oct 2019</w:t>
       </w:r>
     </w:p>
     <w:p>
       <w:pPr>
-        <w:ind w:left="115"/>
+        <w:pStyle w:val="ListBullet"/>
       </w:pPr>
       <w:r>
-        <w:t>Riverbed client: Led 3–4 engineers developing Python automation for SteelFusion infrastructure; diagnosed automation-code issues across VMware, storage, and networking environments.</w:t>
+        <w:t xml:space="preserve">Riverbed client: Led </w:t>
+      </w:r>
+      <w:r>
+        <w:rPr>
+          <w:b/>
+        </w:rPr>
+        <w:t>3–4 engineers</w:t>
+      </w:r>
+      <w:r>
+        <w:t xml:space="preserve"> developing </w:t>
+      </w:r>
+      <w:r>
+        <w:rPr>
+          <w:b/>
+        </w:rPr>
+        <w:t>Python</w:t>
+      </w:r>
+      <w:r>
+        <w:t xml:space="preserve"> automation for SteelFusion infrastructure; diagnosed automation-code issues across </w:t>
+      </w:r>
+      <w:r>
+        <w:rPr>
+          <w:b/>
+        </w:rPr>
+        <w:t>VMware</w:t>
+      </w:r>
+      <w:r>
+        <w:t>, storage, and networking environments.</w:t>
       </w:r>
     </w:p>
     <w:p>
       <w:pPr>
-        <w:ind w:left="115"/>
+        <w:pStyle w:val="ListBullet"/>
       </w:pPr>
       <w:r>
-        <w:t>Alcatel-Lucent client: Developed Python scripts for RF and modem-board automation, firmware initialization, and result analysis.</w:t>
+        <w:t xml:space="preserve">Alcatel-Lucent client: Developed </w:t>
+      </w:r>
+      <w:r>
+        <w:rPr>
+          <w:b/>
+        </w:rPr>
+        <w:t>Python</w:t>
+      </w:r>
+      <w:r>
+        <w:t xml:space="preserve"> scripts for RF and modem-board automation, firmware initialization, and result analysis.</w:t>
       </w:r>
     </w:p>
     <w:p>
       <w:r>
         <w:rPr>
           <w:b/>
+          <w:color w:val="17354F"/>
         </w:rPr>
         <w:t>Powerwave Technologies R&amp;D India | Engineer II – Software | Jul 2010–May 2013</w:t>
       </w:r>
     </w:p>
     <w:p>
       <w:pPr>
-        <w:ind w:left="115"/>
+        <w:pStyle w:val="ListBullet"/>
       </w:pPr>
       <w:r>
-        <w:t>Developed Python scripts for radio-hardware interface data analysis and automated workflows using LabVIEW.</w:t>
+        <w:t xml:space="preserve">Developed </w:t>
+      </w:r>
+      <w:r>
+        <w:rPr>
+          <w:b/>
+        </w:rPr>
+        <w:t>Python</w:t>
+      </w:r>
+      <w:r>
+        <w:t xml:space="preserve"> scripts for radio-hardware interface data analysis and automated workflows using LabVIEW.</w:t>
       </w:r>
     </w:p>
     <w:p>
+      <w:pPr>
+        <w:spacing w:before="120"/>
+      </w:pPr>
       <w:r>
         <w:rPr>
           <w:b/>
+          <w:color w:val="17354F"/>
           <w:sz w:val="20"/>
         </w:rPr>
         <w:t>EDUCATION</w:t>
@@ -157,17 +721,44 @@
     </w:p>
     <w:p>
       <w:r>
-        <w:t>M.Tech, Artificial Intelligence and Machine Learning | IIT Madras | Pursuing</w:t>
+        <w:t xml:space="preserve">M.Tech, </w:t>
+      </w:r>
+      <w:r>
+        <w:rPr>
+          <w:b/>
+        </w:rPr>
+        <w:t>Artificial Intelligence and Machine Learning</w:t>
+      </w:r>
+      <w:r>
+        <w:t xml:space="preserve"> | </w:t>
+      </w:r>
+      <w:r>
+        <w:rPr>
+          <w:b/>
+        </w:rPr>
+        <w:t>IIT Madras</w:t>
+      </w:r>
+      <w:r>
+        <w:t xml:space="preserve"> | Pursuing</w:t>
       </w:r>
     </w:p>
     <w:p>
       <w:r>
-        <w:t>B.Tech, Electronics &amp; Communication Engineering | NIT Patna | 2010 | CGPA: 8.73/10</w:t>
+        <w:t xml:space="preserve">B.Tech, Electronics &amp; Communication Engineering | </w:t>
+      </w:r>
+      <w:r>
+        <w:rPr>
+          <w:b/>
+        </w:rPr>
+        <w:t>NIT Patna</w:t>
+      </w:r>
+      <w:r>
+        <w:t xml:space="preserve"> | 2010 | CGPA: 8.73/10</w:t>
       </w:r>
     </w:p>
     <w:sectPr>
       <w:pgSz w:w="11909" w:h="16834"/>
-      <w:pgMar w:top="648" w:right="792" w:bottom="648" w:left="792" w:header="720" w:footer="720" w:gutter="0"/>
+      <w:pgMar w:top="547" w:right="691" w:bottom="547" w:left="691" w:header="720" w:footer="720" w:gutter="0"/>
       <w:cols w:space="720"/>
       <w:docGrid w:linePitch="360"/>
     </w:sectPr>
@@ -539,11 +1130,11 @@
     <w:qFormat/>
     <w:rsid w:val="00FC693F"/>
     <w:pPr>
-      <w:spacing w:after="60"/>
+      <w:spacing w:after="80"/>
     </w:pPr>
     <w:rPr>
       <w:rFonts w:ascii="Calibri" w:hAnsi="Calibri"/>
-      <w:sz w:val="18"/>
+      <w:sz w:val="19"/>
     </w:rPr>
   </w:style>
   <w:style w:type="paragraph" w:styleId="Header">

</xml_diff>

<commit_message>
Highlight architecture contributions and separate contact details
</commit_message>
<xml_diff>
--- a/resume/Sumit_Singh_Jadaun_Resume.docx
+++ b/resume/Sumit_Singh_Jadaun_Resume.docx
@@ -36,8 +36,30 @@
       <w:pPr>
         <w:ind w:right="1584"/>
       </w:pPr>
+      <w:r/>
       <w:r>
-        <w:t>+91 8073420319 | sumitsinghjadaun@gmail.com</w:t>
+        <w:rPr>
+          <w:b/>
+        </w:rPr>
+        <w:t>Phone:</w:t>
+      </w:r>
+      <w:r>
+        <w:t xml:space="preserve"> +91 8073420319</w:t>
+      </w:r>
+    </w:p>
+    <w:p>
+      <w:pPr>
+        <w:ind w:right="1584"/>
+      </w:pPr>
+      <w:r/>
+      <w:r>
+        <w:rPr>
+          <w:b/>
+        </w:rPr>
+        <w:t>Email:</w:t>
+      </w:r>
+      <w:r>
+        <w:t xml:space="preserve"> sumitsinghjadaun@gmail.com</w:t>
       </w:r>
     </w:p>
     <w:p>
@@ -96,10 +118,28 @@
         <w:rPr>
           <w:b/>
         </w:rPr>
-        <w:t>microservice design</w:t>
+        <w:t>microservice architecture</w:t>
       </w:r>
       <w:r>
-        <w:t xml:space="preserve"> and leadership of a </w:t>
+        <w:t xml:space="preserve">, </w:t>
+      </w:r>
+      <w:r>
+        <w:rPr>
+          <w:b/>
+        </w:rPr>
+        <w:t>API design</w:t>
+      </w:r>
+      <w:r>
+        <w:t xml:space="preserve">, </w:t>
+      </w:r>
+      <w:r>
+        <w:rPr>
+          <w:b/>
+        </w:rPr>
+        <w:t>event-driven integration</w:t>
+      </w:r>
+      <w:r>
+        <w:t xml:space="preserve">, and leadership of a </w:t>
       </w:r>
       <w:r>
         <w:rPr>
@@ -545,7 +585,34 @@
         <w:pStyle w:val="ListBullet"/>
       </w:pPr>
       <w:r>
-        <w:t xml:space="preserve">Created </w:t>
+        <w:t xml:space="preserve">Designed </w:t>
+      </w:r>
+      <w:r>
+        <w:rPr>
+          <w:b/>
+        </w:rPr>
+        <w:t>REST/gRPC</w:t>
+      </w:r>
+      <w:r>
+        <w:t xml:space="preserve"> interfaces and </w:t>
+      </w:r>
+      <w:r>
+        <w:rPr>
+          <w:b/>
+        </w:rPr>
+        <w:t>Protocol Buffer</w:t>
+      </w:r>
+      <w:r>
+        <w:t xml:space="preserve"> contracts for </w:t>
+      </w:r>
+      <w:r>
+        <w:rPr>
+          <w:b/>
+        </w:rPr>
+        <w:t>Go microservices</w:t>
+      </w:r>
+      <w:r>
+        <w:t xml:space="preserve">; created </w:t>
       </w:r>
       <w:r>
         <w:rPr>
@@ -554,7 +621,25 @@
         <w:t>Helm</w:t>
       </w:r>
       <w:r>
-        <w:t xml:space="preserve"> charts for </w:t>
+        <w:t xml:space="preserve"> charts defining deployments, services, </w:t>
+      </w:r>
+      <w:r>
+        <w:rPr>
+          <w:b/>
+        </w:rPr>
+        <w:t>ConfigMaps</w:t>
+      </w:r>
+      <w:r>
+        <w:t xml:space="preserve">, </w:t>
+      </w:r>
+      <w:r>
+        <w:rPr>
+          <w:b/>
+        </w:rPr>
+        <w:t>Secrets</w:t>
+      </w:r>
+      <w:r>
+        <w:t xml:space="preserve">, and service accounts for </w:t>
       </w:r>
       <w:r>
         <w:rPr>
@@ -563,7 +648,85 @@
         <w:t>Kubernetes</w:t>
       </w:r>
       <w:r>
-        <w:t xml:space="preserve"> deployments across development, staging, and production environments, including services, configuration, secrets, and service accounts.</w:t>
+        <w:t xml:space="preserve"> clusters.</w:t>
+      </w:r>
+    </w:p>
+    <w:p>
+      <w:pPr>
+        <w:pStyle w:val="ListBullet"/>
+      </w:pPr>
+      <w:r>
+        <w:t xml:space="preserve">Contributed to </w:t>
+      </w:r>
+      <w:r>
+        <w:rPr>
+          <w:b/>
+        </w:rPr>
+        <w:t>microservice architecture</w:t>
+      </w:r>
+      <w:r>
+        <w:t xml:space="preserve"> discussions and evaluated </w:t>
+      </w:r>
+      <w:r>
+        <w:rPr>
+          <w:b/>
+        </w:rPr>
+        <w:t>Kafka</w:t>
+      </w:r>
+      <w:r>
+        <w:t xml:space="preserve"> client libraries through </w:t>
+      </w:r>
+      <w:r>
+        <w:rPr>
+          <w:b/>
+        </w:rPr>
+        <w:t>proofs of concept</w:t>
+      </w:r>
+      <w:r>
+        <w:t xml:space="preserve">; developed </w:t>
+      </w:r>
+      <w:r>
+        <w:rPr>
+          <w:b/>
+        </w:rPr>
+        <w:t>producers and consumers</w:t>
+      </w:r>
+      <w:r>
+        <w:t xml:space="preserve"> for audit-event and service integration use cases.</w:t>
+      </w:r>
+    </w:p>
+    <w:p>
+      <w:pPr>
+        <w:pStyle w:val="ListBullet"/>
+      </w:pPr>
+      <w:r>
+        <w:t xml:space="preserve">Proposed approaches for a monitor-aggregator microservice and centralized shared component-health and pod-status logic in reusable </w:t>
+      </w:r>
+      <w:r>
+        <w:rPr>
+          <w:b/>
+        </w:rPr>
+        <w:t>Python</w:t>
+      </w:r>
+      <w:r>
+        <w:t xml:space="preserve"> framework classes.</w:t>
+      </w:r>
+    </w:p>
+    <w:p>
+      <w:pPr>
+        <w:pStyle w:val="ListBullet"/>
+      </w:pPr>
+      <w:r>
+        <w:t xml:space="preserve">Guided </w:t>
+      </w:r>
+      <w:r>
+        <w:rPr>
+          <w:b/>
+        </w:rPr>
+        <w:t>technical design</w:t>
+      </w:r>
+      <w:r>
+        <w:t xml:space="preserve"> discussions, decomposed features into epics and stories, and coordinated with cross-functional teams to resolve engineering dependencies.</w:t>
       </w:r>
     </w:p>
     <w:p>

</xml_diff>

<commit_message>
Add LinkedIn profile as a separate clickable contact line
</commit_message>
<xml_diff>
--- a/resume/Sumit_Singh_Jadaun_Resume.docx
+++ b/resume/Sumit_Singh_Jadaun_Resume.docx
@@ -61,6 +61,25 @@
       <w:r>
         <w:t xml:space="preserve"> sumitsinghjadaun@gmail.com</w:t>
       </w:r>
+    </w:p>
+    <w:p>
+      <w:pPr>
+        <w:ind w:right="1584"/>
+      </w:pPr>
+      <w:r>
+        <w:rPr>
+          <w:b/>
+        </w:rPr>
+        <w:t xml:space="preserve">LinkedIn: </w:t>
+      </w:r>
+      <w:hyperlink r:id="rId9">
+        <w:r>
+          <w:rPr>
+            <w:color w:val="17354F"/>
+          </w:rPr>
+          <w:t>linkedin.com/in/sumit-singh-jadaun-06a14b23</w:t>
+        </w:r>
+      </w:hyperlink>
     </w:p>
     <w:p>
       <w:pPr>

</xml_diff>

<commit_message>
Lead with Go microservice design and move Python framework bullet last
</commit_message>
<xml_diff>
--- a/resume/Sumit_Singh_Jadaun_Resume.docx
+++ b/resume/Sumit_Singh_Jadaun_Resume.docx
@@ -454,156 +454,6 @@
         <w:pStyle w:val="ListBullet"/>
       </w:pPr>
       <w:r>
-        <w:t xml:space="preserve">Led </w:t>
-      </w:r>
-      <w:r>
-        <w:rPr>
-          <w:b/>
-        </w:rPr>
-        <w:t>six engineers</w:t>
-      </w:r>
-      <w:r>
-        <w:t xml:space="preserve"> developing the Atlas </w:t>
-      </w:r>
-      <w:r>
-        <w:rPr>
-          <w:b/>
-        </w:rPr>
-        <w:t>Python</w:t>
-      </w:r>
-      <w:r>
-        <w:t xml:space="preserve"> automation framework; implemented logging and reporting enhancements and completed </w:t>
-      </w:r>
-      <w:r>
-        <w:rPr>
-          <w:b/>
-        </w:rPr>
-        <w:t>Python</w:t>
-      </w:r>
-      <w:r>
-        <w:t xml:space="preserve"> 3.6-to-3.10 and plugin migration.</w:t>
-      </w:r>
-    </w:p>
-    <w:p>
-      <w:pPr>
-        <w:pStyle w:val="ListBullet"/>
-      </w:pPr>
-      <w:r>
-        <w:t xml:space="preserve">Built </w:t>
-      </w:r>
-      <w:r>
-        <w:rPr>
-          <w:b/>
-        </w:rPr>
-        <w:t>Go services</w:t>
-      </w:r>
-      <w:r>
-        <w:t xml:space="preserve"> using the </w:t>
-      </w:r>
-      <w:r>
-        <w:rPr>
-          <w:b/>
-        </w:rPr>
-        <w:t>Temporal Go SDK</w:t>
-      </w:r>
-      <w:r>
-        <w:t xml:space="preserve"> to start workflows and handle pause, resume, and cancellation signals; implemented </w:t>
-      </w:r>
-      <w:r>
-        <w:rPr>
-          <w:b/>
-        </w:rPr>
-        <w:t>REST interfaces</w:t>
-      </w:r>
-      <w:r>
-        <w:t xml:space="preserve">, </w:t>
-      </w:r>
-      <w:r>
-        <w:rPr>
-          <w:b/>
-        </w:rPr>
-        <w:t>OpenAPI</w:t>
-      </w:r>
-      <w:r>
-        <w:t xml:space="preserve"> generation, and </w:t>
-      </w:r>
-      <w:r>
-        <w:rPr>
-          <w:b/>
-        </w:rPr>
-        <w:t>gRPC</w:t>
-      </w:r>
-      <w:r>
-        <w:t xml:space="preserve"> health checks.</w:t>
-      </w:r>
-    </w:p>
-    <w:p>
-      <w:pPr>
-        <w:pStyle w:val="ListBullet"/>
-      </w:pPr>
-      <w:r>
-        <w:t xml:space="preserve">Developed </w:t>
-      </w:r>
-      <w:r>
-        <w:rPr>
-          <w:b/>
-        </w:rPr>
-        <w:t>authorization</w:t>
-      </w:r>
-      <w:r>
-        <w:t xml:space="preserve"> APIs and audit-logging middleware with </w:t>
-      </w:r>
-      <w:r>
-        <w:rPr>
-          <w:b/>
-        </w:rPr>
-        <w:t>Protocol Buffers</w:t>
-      </w:r>
-      <w:r>
-        <w:t xml:space="preserve"> and </w:t>
-      </w:r>
-      <w:r>
-        <w:rPr>
-          <w:b/>
-        </w:rPr>
-        <w:t>Kafka</w:t>
-      </w:r>
-      <w:r>
-        <w:t xml:space="preserve"> producers using </w:t>
-      </w:r>
-      <w:r>
-        <w:rPr>
-          <w:b/>
-        </w:rPr>
-        <w:t>SASL</w:t>
-      </w:r>
-      <w:r>
-        <w:t xml:space="preserve"> authentication; implemented retry handling for </w:t>
-      </w:r>
-      <w:r>
-        <w:rPr>
-          <w:b/>
-        </w:rPr>
-        <w:t>Kafka</w:t>
-      </w:r>
-      <w:r>
-        <w:t xml:space="preserve"> and </w:t>
-      </w:r>
-      <w:r>
-        <w:rPr>
-          <w:b/>
-        </w:rPr>
-        <w:t>Vault</w:t>
-      </w:r>
-      <w:r>
-        <w:t xml:space="preserve"> connectivity.</w:t>
-      </w:r>
-    </w:p>
-    <w:p>
-      <w:pPr>
-        <w:pStyle w:val="ListBullet"/>
-      </w:pPr>
-      <w:r>
         <w:t xml:space="preserve">Designed </w:t>
       </w:r>
       <w:r>
@@ -675,84 +525,6 @@
         <w:pStyle w:val="ListBullet"/>
       </w:pPr>
       <w:r>
-        <w:t xml:space="preserve">Contributed to </w:t>
-      </w:r>
-      <w:r>
-        <w:rPr>
-          <w:b/>
-        </w:rPr>
-        <w:t>microservice architecture</w:t>
-      </w:r>
-      <w:r>
-        <w:t xml:space="preserve"> discussions and evaluated </w:t>
-      </w:r>
-      <w:r>
-        <w:rPr>
-          <w:b/>
-        </w:rPr>
-        <w:t>Kafka</w:t>
-      </w:r>
-      <w:r>
-        <w:t xml:space="preserve"> client libraries through </w:t>
-      </w:r>
-      <w:r>
-        <w:rPr>
-          <w:b/>
-        </w:rPr>
-        <w:t>proofs of concept</w:t>
-      </w:r>
-      <w:r>
-        <w:t xml:space="preserve">; developed </w:t>
-      </w:r>
-      <w:r>
-        <w:rPr>
-          <w:b/>
-        </w:rPr>
-        <w:t>producers and consumers</w:t>
-      </w:r>
-      <w:r>
-        <w:t xml:space="preserve"> for audit-event and service integration use cases.</w:t>
-      </w:r>
-    </w:p>
-    <w:p>
-      <w:pPr>
-        <w:pStyle w:val="ListBullet"/>
-      </w:pPr>
-      <w:r>
-        <w:t xml:space="preserve">Proposed approaches for a monitor-aggregator microservice and centralized shared component-health and pod-status logic in reusable </w:t>
-      </w:r>
-      <w:r>
-        <w:rPr>
-          <w:b/>
-        </w:rPr>
-        <w:t>Python</w:t>
-      </w:r>
-      <w:r>
-        <w:t xml:space="preserve"> framework classes.</w:t>
-      </w:r>
-    </w:p>
-    <w:p>
-      <w:pPr>
-        <w:pStyle w:val="ListBullet"/>
-      </w:pPr>
-      <w:r>
-        <w:t xml:space="preserve">Guided </w:t>
-      </w:r>
-      <w:r>
-        <w:rPr>
-          <w:b/>
-        </w:rPr>
-        <w:t>technical design</w:t>
-      </w:r>
-      <w:r>
-        <w:t xml:space="preserve"> discussions, decomposed features into epics and stories, and coordinated with cross-functional teams to resolve engineering dependencies.</w:t>
-      </w:r>
-    </w:p>
-    <w:p>
-      <w:pPr>
-        <w:pStyle w:val="ListBullet"/>
-      </w:pPr>
-      <w:r>
         <w:t xml:space="preserve">Contributed </w:t>
       </w:r>
       <w:r>
@@ -799,6 +571,234 @@
       </w:r>
       <w:r>
         <w:t>.</w:t>
+      </w:r>
+    </w:p>
+    <w:p>
+      <w:pPr>
+        <w:pStyle w:val="ListBullet"/>
+      </w:pPr>
+      <w:r>
+        <w:t xml:space="preserve">Built </w:t>
+      </w:r>
+      <w:r>
+        <w:rPr>
+          <w:b/>
+        </w:rPr>
+        <w:t>Go services</w:t>
+      </w:r>
+      <w:r>
+        <w:t xml:space="preserve"> using the </w:t>
+      </w:r>
+      <w:r>
+        <w:rPr>
+          <w:b/>
+        </w:rPr>
+        <w:t>Temporal Go SDK</w:t>
+      </w:r>
+      <w:r>
+        <w:t xml:space="preserve"> to start workflows and handle pause, resume, and cancellation signals; implemented </w:t>
+      </w:r>
+      <w:r>
+        <w:rPr>
+          <w:b/>
+        </w:rPr>
+        <w:t>REST interfaces</w:t>
+      </w:r>
+      <w:r>
+        <w:t xml:space="preserve">, </w:t>
+      </w:r>
+      <w:r>
+        <w:rPr>
+          <w:b/>
+        </w:rPr>
+        <w:t>OpenAPI</w:t>
+      </w:r>
+      <w:r>
+        <w:t xml:space="preserve"> generation, and </w:t>
+      </w:r>
+      <w:r>
+        <w:rPr>
+          <w:b/>
+        </w:rPr>
+        <w:t>gRPC</w:t>
+      </w:r>
+      <w:r>
+        <w:t xml:space="preserve"> health checks.</w:t>
+      </w:r>
+    </w:p>
+    <w:p>
+      <w:pPr>
+        <w:pStyle w:val="ListBullet"/>
+      </w:pPr>
+      <w:r>
+        <w:t xml:space="preserve">Contributed to </w:t>
+      </w:r>
+      <w:r>
+        <w:rPr>
+          <w:b/>
+        </w:rPr>
+        <w:t>microservice architecture</w:t>
+      </w:r>
+      <w:r>
+        <w:t xml:space="preserve"> discussions and evaluated </w:t>
+      </w:r>
+      <w:r>
+        <w:rPr>
+          <w:b/>
+        </w:rPr>
+        <w:t>Kafka</w:t>
+      </w:r>
+      <w:r>
+        <w:t xml:space="preserve"> client libraries through </w:t>
+      </w:r>
+      <w:r>
+        <w:rPr>
+          <w:b/>
+        </w:rPr>
+        <w:t>proofs of concept</w:t>
+      </w:r>
+      <w:r>
+        <w:t xml:space="preserve">; developed </w:t>
+      </w:r>
+      <w:r>
+        <w:rPr>
+          <w:b/>
+        </w:rPr>
+        <w:t>producers and consumers</w:t>
+      </w:r>
+      <w:r>
+        <w:t xml:space="preserve"> for audit-event and service integration use cases.</w:t>
+      </w:r>
+    </w:p>
+    <w:p>
+      <w:pPr>
+        <w:pStyle w:val="ListBullet"/>
+      </w:pPr>
+      <w:r>
+        <w:t xml:space="preserve">Developed </w:t>
+      </w:r>
+      <w:r>
+        <w:rPr>
+          <w:b/>
+        </w:rPr>
+        <w:t>authorization</w:t>
+      </w:r>
+      <w:r>
+        <w:t xml:space="preserve"> APIs and audit-logging middleware with </w:t>
+      </w:r>
+      <w:r>
+        <w:rPr>
+          <w:b/>
+        </w:rPr>
+        <w:t>Protocol Buffers</w:t>
+      </w:r>
+      <w:r>
+        <w:t xml:space="preserve"> and </w:t>
+      </w:r>
+      <w:r>
+        <w:rPr>
+          <w:b/>
+        </w:rPr>
+        <w:t>Kafka</w:t>
+      </w:r>
+      <w:r>
+        <w:t xml:space="preserve"> producers using </w:t>
+      </w:r>
+      <w:r>
+        <w:rPr>
+          <w:b/>
+        </w:rPr>
+        <w:t>SASL</w:t>
+      </w:r>
+      <w:r>
+        <w:t xml:space="preserve"> authentication; implemented retry handling for </w:t>
+      </w:r>
+      <w:r>
+        <w:rPr>
+          <w:b/>
+        </w:rPr>
+        <w:t>Kafka</w:t>
+      </w:r>
+      <w:r>
+        <w:t xml:space="preserve"> and </w:t>
+      </w:r>
+      <w:r>
+        <w:rPr>
+          <w:b/>
+        </w:rPr>
+        <w:t>Vault</w:t>
+      </w:r>
+      <w:r>
+        <w:t xml:space="preserve"> connectivity.</w:t>
+      </w:r>
+    </w:p>
+    <w:p>
+      <w:pPr>
+        <w:pStyle w:val="ListBullet"/>
+      </w:pPr>
+      <w:r>
+        <w:t xml:space="preserve">Guided </w:t>
+      </w:r>
+      <w:r>
+        <w:rPr>
+          <w:b/>
+        </w:rPr>
+        <w:t>technical design</w:t>
+      </w:r>
+      <w:r>
+        <w:t xml:space="preserve"> discussions, decomposed features into epics and stories, and coordinated with cross-functional teams to resolve engineering dependencies.</w:t>
+      </w:r>
+    </w:p>
+    <w:p>
+      <w:pPr>
+        <w:pStyle w:val="ListBullet"/>
+      </w:pPr>
+      <w:r>
+        <w:t xml:space="preserve">Proposed approaches for a monitor-aggregator microservice and centralized shared component-health and pod-status logic in reusable </w:t>
+      </w:r>
+      <w:r>
+        <w:rPr>
+          <w:b/>
+        </w:rPr>
+        <w:t>Python</w:t>
+      </w:r>
+      <w:r>
+        <w:t xml:space="preserve"> framework classes.</w:t>
+      </w:r>
+    </w:p>
+    <w:p>
+      <w:pPr>
+        <w:pStyle w:val="ListBullet"/>
+      </w:pPr>
+      <w:r>
+        <w:t xml:space="preserve">Led </w:t>
+      </w:r>
+      <w:r>
+        <w:rPr>
+          <w:b/>
+        </w:rPr>
+        <w:t>six engineers</w:t>
+      </w:r>
+      <w:r>
+        <w:t xml:space="preserve"> developing the Atlas </w:t>
+      </w:r>
+      <w:r>
+        <w:rPr>
+          <w:b/>
+        </w:rPr>
+        <w:t>Python</w:t>
+      </w:r>
+      <w:r>
+        <w:t xml:space="preserve"> automation framework; implemented logging and reporting enhancements and completed </w:t>
+      </w:r>
+      <w:r>
+        <w:rPr>
+          <w:b/>
+        </w:rPr>
+        <w:t>Python</w:t>
+      </w:r>
+      <w:r>
+        <w:t xml:space="preserve"> 3.6-to-3.10 and plugin migration.</w:t>
       </w:r>
     </w:p>
     <w:p>

</xml_diff>

<commit_message>
Add confirmed Dell FastAPI and Pydantic microservice experience
</commit_message>
<xml_diff>
--- a/resume/Sumit_Singh_Jadaun_Resume.docx
+++ b/resume/Sumit_Singh_Jadaun_Resume.docx
@@ -266,6 +266,24 @@
         <w:rPr>
           <w:b/>
         </w:rPr>
+        <w:t>FastAPI</w:t>
+      </w:r>
+      <w:r>
+        <w:t xml:space="preserve">, </w:t>
+      </w:r>
+      <w:r>
+        <w:rPr>
+          <w:b/>
+        </w:rPr>
+        <w:t>Pydantic</w:t>
+      </w:r>
+      <w:r>
+        <w:t xml:space="preserve">, </w:t>
+      </w:r>
+      <w:r>
+        <w:rPr>
+          <w:b/>
+        </w:rPr>
         <w:t>REST APIs</w:t>
       </w:r>
       <w:r>
@@ -518,6 +536,50 @@
       </w:r>
       <w:r>
         <w:t xml:space="preserve"> clusters.</w:t>
+      </w:r>
+    </w:p>
+    <w:p>
+      <w:pPr>
+        <w:pStyle w:val="ListBullet"/>
+      </w:pPr>
+      <w:r>
+        <w:t xml:space="preserve">Contributed to the </w:t>
+      </w:r>
+      <w:r>
+        <w:rPr>
+          <w:b/>
+        </w:rPr>
+        <w:t>architecture, design, and development</w:t>
+      </w:r>
+      <w:r>
+        <w:t xml:space="preserve"> of </w:t>
+      </w:r>
+      <w:r>
+        <w:rPr>
+          <w:b/>
+        </w:rPr>
+        <w:t>Python</w:t>
+      </w:r>
+      <w:r>
+        <w:t xml:space="preserve"> microservices using </w:t>
+      </w:r>
+      <w:r>
+        <w:rPr>
+          <w:b/>
+        </w:rPr>
+        <w:t>FastAPI</w:t>
+      </w:r>
+      <w:r>
+        <w:t xml:space="preserve"> and </w:t>
+      </w:r>
+      <w:r>
+        <w:rPr>
+          <w:b/>
+        </w:rPr>
+        <w:t>Pydantic</w:t>
+      </w:r>
+      <w:r>
+        <w:t xml:space="preserve"> for API implementation and data-model validation.</w:t>
       </w:r>
     </w:p>
     <w:p>

</xml_diff>

<commit_message>
Add top-right profile photo and embed PDF fonts
</commit_message>
<xml_diff>
--- a/resume/Sumit_Singh_Jadaun_Resume.docx
+++ b/resume/Sumit_Singh_Jadaun_Resume.docx
@@ -13,6 +13,48 @@
           <w:sz w:val="40"/>
         </w:rPr>
         <w:t>SUMIT SINGH JADAUN</w:t>
+      </w:r>
+      <w:r>
+        <w:drawing>
+          <wp:anchor distT="0" distB="0" distL="0" distR="0" simplePos="0" relativeHeight="251658240" behindDoc="0" locked="0" layoutInCell="1" allowOverlap="1">
+            <wp:simplePos x="0" y="0"/>
+            <wp:positionH relativeFrom="margin">
+              <wp:align>right</wp:align>
+            </wp:positionH>
+            <wp:positionV relativeFrom="margin">
+              <wp:posOffset>0</wp:posOffset>
+            </wp:positionV>
+            <wp:extent cx="886968" cy="1330452"/>
+            <wp:wrapNone/>
+            <wp:docPr id="1" name="Picture 1"/>
+            <wp:cNvGraphicFramePr xmlns:a="http://schemas.openxmlformats.org/drawingml/2006/main">
+              <a:graphicFrameLocks noChangeAspect="1"/>
+            </wp:cNvGraphicFramePr>
+            <a:graphic xmlns:a="http://schemas.openxmlformats.org/drawingml/2006/main" xmlns:pic="http://schemas.openxmlformats.org/drawingml/2006/picture">
+              <a:graphicData uri="http://schemas.openxmlformats.org/drawingml/2006/picture">
+                <pic:pic>
+                  <pic:nvPicPr>
+                    <pic:cNvPr id="0" name="Sumit_photo.jpg"/>
+                    <pic:cNvPicPr/>
+                  </pic:nvPicPr>
+                  <pic:blipFill>
+                    <a:blip r:embed="rId10"/>
+                    <a:stretch>
+                      <a:fillRect/>
+                    </a:stretch>
+                  </pic:blipFill>
+                  <pic:spPr>
+                    <a:xfrm>
+                      <a:off x="0" y="0"/>
+                      <a:ext cx="886968" cy="1330452"/>
+                    </a:xfrm>
+                    <a:prstGeom prst="rect"/>
+                  </pic:spPr>
+                </pic:pic>
+              </a:graphicData>
+            </a:graphic>
+          </wp:anchor>
+        </w:drawing>
       </w:r>
     </w:p>
     <w:p>

</xml_diff>

<commit_message>
Update headline to Golang Python lead developer and infrastructure architect
</commit_message>
<xml_diff>
--- a/resume/Sumit_Singh_Jadaun_Resume.docx
+++ b/resume/Sumit_Singh_Jadaun_Resume.docx
@@ -62,7 +62,7 @@
         <w:ind w:right="1584"/>
       </w:pPr>
       <w:r>
-        <w:t xml:space="preserve">Go / </w:t>
+        <w:t>Golang/</w:t>
       </w:r>
       <w:r>
         <w:rPr>
@@ -71,7 +71,7 @@
         <w:t>Python</w:t>
       </w:r>
       <w:r>
-        <w:t xml:space="preserve"> Lead Engineer | Cloud-Native Services &amp; Infrastructure Automation</w:t>
+        <w:t xml:space="preserve"> Lead Developer | Cloud Native Services and Infrastructure Architect</w:t>
       </w:r>
     </w:p>
     <w:p>

</xml_diff>

<commit_message>
Update Dell team leadership size to 8–10 engineers
</commit_message>
<xml_diff>
--- a/resume/Sumit_Singh_Jadaun_Resume.docx
+++ b/resume/Sumit_Singh_Jadaun_Resume.docx
@@ -206,19 +206,19 @@
         <w:rPr>
           <w:b/>
         </w:rPr>
-        <w:t>six-engineer</w:t>
+        <w:t>Python</w:t>
       </w:r>
       <w:r>
-        <w:t xml:space="preserve"> </w:t>
+        <w:t xml:space="preserve"> development team of </w:t>
       </w:r>
       <w:r>
         <w:rPr>
           <w:b/>
         </w:rPr>
-        <w:t>Python</w:t>
+        <w:t>8–10 engineers</w:t>
       </w:r>
       <w:r>
-        <w:t xml:space="preserve"> development team. Hands-on work with </w:t>
+        <w:t xml:space="preserve">. Hands-on work with </w:t>
       </w:r>
       <w:r>
         <w:rPr>
@@ -881,7 +881,7 @@
         <w:rPr>
           <w:b/>
         </w:rPr>
-        <w:t>six engineers</w:t>
+        <w:t>8–10 engineers</w:t>
       </w:r>
       <w:r>
         <w:t xml:space="preserve"> developing the Atlas </w:t>

</xml_diff>

<commit_message>
Separate authentication and authorization security terminology
</commit_message>
<xml_diff>
--- a/resume/Sumit_Singh_Jadaun_Resume.docx
+++ b/resume/Sumit_Singh_Jadaun_Resume.docx
@@ -436,13 +436,13 @@
         <w:t>HashiCorp Vault</w:t>
       </w:r>
       <w:r>
-        <w:t xml:space="preserve">, </w:t>
+        <w:t xml:space="preserve">, JWT, </w:t>
       </w:r>
       <w:r>
         <w:rPr>
           <w:b/>
         </w:rPr>
-        <w:t>authorization</w:t>
+        <w:t>mTLS</w:t>
       </w:r>
       <w:r>
         <w:t xml:space="preserve">, </w:t>
@@ -451,7 +451,25 @@
         <w:rPr>
           <w:b/>
         </w:rPr>
-        <w:t>audit logging</w:t>
+        <w:t>OpenID Connect</w:t>
+      </w:r>
+      <w:r>
+        <w:t xml:space="preserve">, </w:t>
+      </w:r>
+      <w:r>
+        <w:rPr>
+          <w:b/>
+        </w:rPr>
+        <w:t>OAuth 2.0</w:t>
+      </w:r>
+      <w:r>
+        <w:t xml:space="preserve">, </w:t>
+      </w:r>
+      <w:r>
+        <w:rPr>
+          <w:b/>
+        </w:rPr>
+        <w:t>RBAC</w:t>
       </w:r>
       <w:r/>
     </w:p>
@@ -785,19 +803,64 @@
         <w:rPr>
           <w:b/>
         </w:rPr>
-        <w:t>authorization</w:t>
+        <w:t>authentication</w:t>
       </w:r>
       <w:r>
-        <w:t xml:space="preserve"> APIs and audit-logging middleware with </w:t>
+        <w:t xml:space="preserve"> (</w:t>
       </w:r>
       <w:r>
         <w:rPr>
           <w:b/>
         </w:rPr>
-        <w:t>Protocol Buffers</w:t>
+        <w:t>OpenID Connect</w:t>
       </w:r>
       <w:r>
-        <w:t xml:space="preserve"> and </w:t>
+        <w:t xml:space="preserve">, </w:t>
+      </w:r>
+      <w:r>
+        <w:rPr>
+          <w:b/>
+        </w:rPr>
+        <w:t>mTLS</w:t>
+      </w:r>
+      <w:r>
+        <w:t xml:space="preserve">, </w:t>
+      </w:r>
+      <w:r>
+        <w:rPr>
+          <w:b/>
+        </w:rPr>
+        <w:t>JWT/bearer-token validation</w:t>
+      </w:r>
+      <w:r>
+        <w:t xml:space="preserve">) and </w:t>
+      </w:r>
+      <w:r>
+        <w:rPr>
+          <w:b/>
+        </w:rPr>
+        <w:t>authorization</w:t>
+      </w:r>
+      <w:r>
+        <w:t xml:space="preserve"> (</w:t>
+      </w:r>
+      <w:r>
+        <w:rPr>
+          <w:b/>
+        </w:rPr>
+        <w:t>OAuth 2.0</w:t>
+      </w:r>
+      <w:r>
+        <w:t xml:space="preserve">, </w:t>
+      </w:r>
+      <w:r>
+        <w:rPr>
+          <w:b/>
+        </w:rPr>
+        <w:t>RBAC</w:t>
+      </w:r>
+      <w:r>
+        <w:t xml:space="preserve">) APIs; implemented </w:t>
       </w:r>
       <w:r>
         <w:rPr>
@@ -806,7 +869,16 @@
         <w:t>Kafka</w:t>
       </w:r>
       <w:r>
-        <w:t xml:space="preserve"> producers using </w:t>
+        <w:t xml:space="preserve"> </w:t>
+      </w:r>
+      <w:r>
+        <w:rPr>
+          <w:b/>
+        </w:rPr>
+        <w:t>audit logging</w:t>
+      </w:r>
+      <w:r>
+        <w:t xml:space="preserve"> with </w:t>
       </w:r>
       <w:r>
         <w:rPr>
@@ -815,7 +887,16 @@
         <w:t>SASL</w:t>
       </w:r>
       <w:r>
-        <w:t xml:space="preserve"> authentication; implemented retry handling for </w:t>
+        <w:t xml:space="preserve"> </w:t>
+      </w:r>
+      <w:r>
+        <w:rPr>
+          <w:b/>
+        </w:rPr>
+        <w:t>authentication</w:t>
+      </w:r>
+      <w:r>
+        <w:t xml:space="preserve"> and retry handling for </w:t>
       </w:r>
       <w:r>
         <w:rPr>
@@ -824,7 +905,7 @@
         <w:t>Kafka</w:t>
       </w:r>
       <w:r>
-        <w:t xml:space="preserve"> and </w:t>
+        <w:t>/</w:t>
       </w:r>
       <w:r>
         <w:rPr>

</xml_diff>

<commit_message>
Clarify Golang and Python backend experience in summary
</commit_message>
<xml_diff>
--- a/resume/Sumit_Singh_Jadaun_Resume.docx
+++ b/resume/Sumit_Singh_Jadaun_Resume.docx
@@ -155,7 +155,7 @@
         <w:t>13+ years</w:t>
       </w:r>
       <w:r>
-        <w:t xml:space="preserve"> of experience spanning backend services, </w:t>
+        <w:t xml:space="preserve"> of experience spanning backend services in Golang and </w:t>
       </w:r>
       <w:r>
         <w:rPr>
@@ -164,7 +164,16 @@
         <w:t>Python</w:t>
       </w:r>
       <w:r>
-        <w:t xml:space="preserve"> automation, and converged/hyperconverged infrastructure. </w:t>
+        <w:t xml:space="preserve">, </w:t>
+      </w:r>
+      <w:r>
+        <w:rPr>
+          <w:b/>
+        </w:rPr>
+        <w:t>infrastructure automation</w:t>
+      </w:r>
+      <w:r>
+        <w:t xml:space="preserve">, and converged/hyperconverged infrastructure. </w:t>
       </w:r>
       <w:r>
         <w:rPr>

</xml_diff>

<commit_message>
Bold JWT keyword in resume skills
</commit_message>
<xml_diff>
--- a/resume/Sumit_Singh_Jadaun_Resume.docx
+++ b/resume/Sumit_Singh_Jadaun_Resume.docx
@@ -445,7 +445,16 @@
         <w:t>HashiCorp Vault</w:t>
       </w:r>
       <w:r>
-        <w:t xml:space="preserve">, JWT, </w:t>
+        <w:t xml:space="preserve">, </w:t>
+      </w:r>
+      <w:r>
+        <w:rPr>
+          <w:b/>
+        </w:rPr>
+        <w:t>JWT</w:t>
+      </w:r>
+      <w:r>
+        <w:t xml:space="preserve">, </w:t>
       </w:r>
       <w:r>
         <w:rPr>

</xml_diff>